<commit_message>
Add Problem 3: flight delay impact on Gen Z loyalty
Notebook additions (sections 12-17):
- Delay distribution plots by generation and loyalty status
- Binned delay analysis with loyalty rate curves per generation
- Logistic regression with Delay x GenZ interaction terms
- Per-generation XGBoost + SHAP comparison for delay sensitivity
- Fine-grained 10-min bin threshold chart ("breaking point")
- Delay resilience summary table

Documentation updated (markdown + DOCX) with Problem 3 methods:
binned delay analysis, logistic regression interaction, per-generation
SHAP comparison — including introductions, justifications, and outputs.

https://claude.ai/code/session_015NQn3PzNZ3TtGhpVCGJEVM
</commit_message>
<xml_diff>
--- a/PROJECT_DOCUMENTATION.docx
+++ b/PROJECT_DOCUMENTATION.docx
@@ -108,7 +108,15 @@
         <w:pStyle w:val="ListNumber"/>
       </w:pPr>
       <w:r>
-        <w:t>8. Results and Insights</w:t>
+        <w:t>8. Machine Learning Methods — Problem 3</w:t>
+      </w:r>
+    </w:p>
+    <w:p>
+      <w:pPr>
+        <w:pStyle w:val="ListNumber"/>
+      </w:pPr>
+      <w:r>
+        <w:t>9. Results and Insights</w:t>
       </w:r>
     </w:p>
     <w:p>
@@ -126,7 +134,7 @@
     </w:p>
     <w:p>
       <w:r>
-        <w:t>This project investigates two core business questions for American Airlines:</w:t>
+        <w:t>This project investigates three core business questions for American Airlines:</w:t>
       </w:r>
     </w:p>
     <w:p>
@@ -153,6 +161,19 @@
     <w:p>
       <w:r>
         <w:t>What actually makes Gen Z stay loyal? We answer this using two gradient boosting models (XGBoost and LightGBM) paired with SHAP explainability to identify and rank the specific service factors that drive Gen Z loyalty enrollment.</w:t>
+      </w:r>
+    </w:p>
+    <w:p>
+      <w:r>
+        <w:rPr>
+          <w:b/>
+        </w:rPr>
+        <w:t>Problem 3 — How does flight delay impact Gen Z loyalty?</w:t>
+      </w:r>
+    </w:p>
+    <w:p>
+      <w:r>
+        <w:t>While Problem 2 identified service factors, this problem focuses on operational friction. It measures resilience: at what delay duration does Gen Z abandon loyalty faster than older generations? We answer this using binned delay analysis, logistic regression with generation interaction terms, and per-generation SHAP comparisons.</w:t>
       </w:r>
     </w:p>
     <w:p>
@@ -3260,15 +3281,271 @@
         <w:pStyle w:val="Heading1"/>
       </w:pPr>
       <w:r>
-        <w:t>8. Results and Insights</w:t>
+        <w:t>8. Machine Learning Methods — Problem 3</w:t>
       </w:r>
     </w:p>
     <w:p>
+      <w:r>
+        <w:t>Problem 3 asks: how does flight delay duration impact the loyalty enrollment probability of Gen Z compared to older generations? While Problem 2 identified service factors (WiFi, cleanliness), this problem focuses on operational friction — measuring at what point a delay causes Gen Z to abandon their loyalty toward the airline.</w:t>
+      </w:r>
+    </w:p>
+    <w:p>
       <w:pPr>
         <w:pStyle w:val="Heading2"/>
       </w:pPr>
       <w:r>
-        <w:t>8.1 Problem 1 — Who Is Gen Z?</w:t>
+        <w:t>8.1 Binned Delay Analysis</w:t>
+      </w:r>
+    </w:p>
+    <w:p>
+      <w:pPr>
+        <w:pStyle w:val="Heading3"/>
+      </w:pPr>
+      <w:r>
+        <w:t>Introduction</w:t>
+      </w:r>
+    </w:p>
+    <w:p>
+      <w:r>
+        <w:t>Delays are binned into practical categories (No Delay, 1-15 min, 16-30 min, 31-60 min, 61-120 min, 120+ min) and the loyalty rate is computed at each level per generation. A finer 10-minute bin analysis is also run up to 180 minutes to pinpoint exact thresholds.</w:t>
+      </w:r>
+    </w:p>
+    <w:p>
+      <w:pPr>
+        <w:pStyle w:val="Heading3"/>
+      </w:pPr>
+      <w:r>
+        <w:t>Why This Is Important for This Problem</w:t>
+      </w:r>
+    </w:p>
+    <w:p>
+      <w:r>
+        <w:t>Raw delay minutes are noisy. Binning reveals the practical "breaking points" where loyalty drops most steeply. If Gen Z's loyalty curve drops earlier and more sharply than Millennials or Gen X, that directly informs American Airlines' operations: which routes to prioritize for on-time performance, and at what delay duration to trigger proactive retention actions.</w:t>
+      </w:r>
+    </w:p>
+    <w:p>
+      <w:pPr>
+        <w:pStyle w:val="Heading3"/>
+      </w:pPr>
+      <w:r>
+        <w:t>Results and Output</w:t>
+      </w:r>
+    </w:p>
+    <w:p>
+      <w:pPr>
+        <w:pStyle w:val="ListBullet"/>
+      </w:pPr>
+      <w:r>
+        <w:t>Loyalty rate table by delay bin and generation — shows exact percentages at each threshold</w:t>
+      </w:r>
+    </w:p>
+    <w:p>
+      <w:pPr>
+        <w:pStyle w:val="ListBullet"/>
+      </w:pPr>
+      <w:r>
+        <w:t>Line charts plotting loyalty rate curves for each generation across delay bins</w:t>
+      </w:r>
+    </w:p>
+    <w:p>
+      <w:pPr>
+        <w:pStyle w:val="ListBullet"/>
+      </w:pPr>
+      <w:r>
+        <w:t>Fine-grained 10-minute bin chart identifying the specific delay duration where Gen Z loyalty drops fastest</w:t>
+      </w:r>
+    </w:p>
+    <w:p>
+      <w:pPr>
+        <w:pStyle w:val="ListBullet"/>
+      </w:pPr>
+      <w:r>
+        <w:t>Delay resilience summary: loyalty rate drop from no-delay to short-delay (1-30 min) and long-delay (60+ min) per generation</w:t>
+      </w:r>
+    </w:p>
+    <w:p>
+      <w:pPr>
+        <w:pStyle w:val="Heading2"/>
+      </w:pPr>
+      <w:r>
+        <w:t>8.2 Logistic Regression with Interaction Terms</w:t>
+      </w:r>
+    </w:p>
+    <w:p>
+      <w:pPr>
+        <w:pStyle w:val="Heading3"/>
+      </w:pPr>
+      <w:r>
+        <w:t>Introduction</w:t>
+      </w:r>
+    </w:p>
+    <w:p>
+      <w:r>
+        <w:t>A logistic regression is fit with Departure Delay, Arrival Delay, a Gen Z indicator, and crucially, Delay x Gen Z interaction terms. The interaction coefficient directly tests whether the effect of delay on loyalty differs for Gen Z versus other generations.</w:t>
+      </w:r>
+    </w:p>
+    <w:p>
+      <w:pPr>
+        <w:pStyle w:val="Heading3"/>
+      </w:pPr>
+      <w:r>
+        <w:t>Why This Is Important for This Problem</w:t>
+      </w:r>
+    </w:p>
+    <w:p>
+      <w:r>
+        <w:t>This is the statistical test for the core hypothesis. The binned analysis shows descriptive patterns, but the interaction term provides a formal p-value answering: "Is the delay-loyalty relationship statistically different for Gen Z?" A significant negative interaction coefficient means delay hurts Gen Z loyalty more than other generations, controlling for age and flight distance.</w:t>
+      </w:r>
+    </w:p>
+    <w:p>
+      <w:pPr>
+        <w:pStyle w:val="Heading3"/>
+      </w:pPr>
+      <w:r>
+        <w:t>Implementation Details</w:t>
+      </w:r>
+    </w:p>
+    <w:p>
+      <w:pPr>
+        <w:pStyle w:val="ListBullet"/>
+      </w:pPr>
+      <w:r>
+        <w:t>Model: statsmodels Logit for full coefficient table with p-values</w:t>
+      </w:r>
+    </w:p>
+    <w:p>
+      <w:pPr>
+        <w:pStyle w:val="ListBullet"/>
+      </w:pPr>
+      <w:r>
+        <w:t>Features: Departure Delay, Arrival Delay, is_genz (binary), dep_delay x genz (interaction), arr_delay x genz (interaction), Age, Flight Distance</w:t>
+      </w:r>
+    </w:p>
+    <w:p>
+      <w:pPr>
+        <w:pStyle w:val="ListBullet"/>
+      </w:pPr>
+      <w:r>
+        <w:t>Target: is_loyal (binary)</w:t>
+      </w:r>
+    </w:p>
+    <w:p>
+      <w:pPr>
+        <w:pStyle w:val="ListBullet"/>
+      </w:pPr>
+      <w:r>
+        <w:t>Output: Odds ratios for each coefficient — the interaction odds ratio shows how much more (or less) each minute of delay affects Gen Z loyalty probability versus the baseline</w:t>
+      </w:r>
+    </w:p>
+    <w:p>
+      <w:pPr>
+        <w:pStyle w:val="Heading3"/>
+      </w:pPr>
+      <w:r>
+        <w:t>Results and Output</w:t>
+      </w:r>
+    </w:p>
+    <w:p>
+      <w:pPr>
+        <w:pStyle w:val="ListBullet"/>
+      </w:pPr>
+      <w:r>
+        <w:t>Full coefficient table with odds ratios, p-values, and significance flags</w:t>
+      </w:r>
+    </w:p>
+    <w:p>
+      <w:pPr>
+        <w:pStyle w:val="ListBullet"/>
+      </w:pPr>
+      <w:r>
+        <w:t>Interpretation of interaction terms: direction (stronger/weaker negative effect) and magnitude</w:t>
+      </w:r>
+    </w:p>
+    <w:p>
+      <w:pPr>
+        <w:pStyle w:val="Heading2"/>
+      </w:pPr>
+      <w:r>
+        <w:t>8.3 Per-Generation SHAP Comparison</w:t>
+      </w:r>
+    </w:p>
+    <w:p>
+      <w:pPr>
+        <w:pStyle w:val="Heading3"/>
+      </w:pPr>
+      <w:r>
+        <w:t>Introduction</w:t>
+      </w:r>
+    </w:p>
+    <w:p>
+      <w:r>
+        <w:t>Separate XGBoost models are trained for Gen Z and for older generations (Millennials + Gen X). SHAP values are computed for the delay features in each model, then compared. If the mean absolute SHAP value for delay is larger in the Gen Z model, delays have a bigger impact on Gen Z loyalty predictions.</w:t>
+      </w:r>
+    </w:p>
+    <w:p>
+      <w:pPr>
+        <w:pStyle w:val="Heading3"/>
+      </w:pPr>
+      <w:r>
+        <w:t>Why This Is Important for This Problem</w:t>
+      </w:r>
+    </w:p>
+    <w:p>
+      <w:r>
+        <w:t>The logistic regression provides a linear test. The per-generation SHAP comparison captures non-linear effects. A delay might not matter until it exceeds 30 minutes, then matter enormously for Gen Z but only modestly for Gen X. SHAP dependence plots visualize these non-linear threshold effects that a linear interaction term would miss.</w:t>
+      </w:r>
+    </w:p>
+    <w:p>
+      <w:pPr>
+        <w:pStyle w:val="Heading3"/>
+      </w:pPr>
+      <w:r>
+        <w:t>Results and Output</w:t>
+      </w:r>
+    </w:p>
+    <w:p>
+      <w:pPr>
+        <w:pStyle w:val="ListBullet"/>
+      </w:pPr>
+      <w:r>
+        <w:t>Mean |SHAP| for departure and arrival delay in each generation's model</w:t>
+      </w:r>
+    </w:p>
+    <w:p>
+      <w:pPr>
+        <w:pStyle w:val="ListBullet"/>
+      </w:pPr>
+      <w:r>
+        <w:t>Gen Z / Older generation ratio — a value &gt; 1.0 means Gen Z is more sensitive to that delay type</w:t>
+      </w:r>
+    </w:p>
+    <w:p>
+      <w:pPr>
+        <w:pStyle w:val="ListBullet"/>
+      </w:pPr>
+      <w:r>
+        <w:t>Side-by-side SHAP dependence scatter plots showing how delay minutes map to loyalty impact for Gen Z vs older generations</w:t>
+      </w:r>
+    </w:p>
+    <w:p>
+      <w:r>
+        <w:br w:type="page"/>
+      </w:r>
+    </w:p>
+    <w:p>
+      <w:pPr>
+        <w:pStyle w:val="Heading1"/>
+      </w:pPr>
+      <w:r>
+        <w:t>9. Results and Insights</w:t>
+      </w:r>
+    </w:p>
+    <w:p>
+      <w:pPr>
+        <w:pStyle w:val="Heading2"/>
+      </w:pPr>
+      <w:r>
+        <w:t>9.1 Problem 1 — Who Is Gen Z?</w:t>
       </w:r>
     </w:p>
     <w:p>
@@ -3341,7 +3618,7 @@
         <w:pStyle w:val="Heading2"/>
       </w:pPr>
       <w:r>
-        <w:t>8.2 Problem 2 — What Motivates Gen Z Loyalty?</w:t>
+        <w:t>9.2 Problem 2 — What Motivates Gen Z Loyalty?</w:t>
       </w:r>
     </w:p>
     <w:p>
@@ -3428,7 +3705,86 @@
         <w:pStyle w:val="Heading2"/>
       </w:pPr>
       <w:r>
-        <w:t>8.3 Method Justification Summary</w:t>
+        <w:t>9.3 Problem 3 — How Do Delays Impact Gen Z Loyalty?</w:t>
+      </w:r>
+    </w:p>
+    <w:p>
+      <w:r>
+        <w:rPr>
+          <w:b/>
+        </w:rPr>
+        <w:t>Delay Tolerance Threshold</w:t>
+      </w:r>
+    </w:p>
+    <w:p>
+      <w:r>
+        <w:t>The binned delay analysis and fine-grained 10-minute bin charts show whether Gen Z's loyalty rate curve drops earlier and more steeply than older generations. The "breaking point" is the delay duration where Gen Z loyalty falls below a critical threshold (e.g., 50%) while older generations remain above it.</w:t>
+      </w:r>
+    </w:p>
+    <w:p>
+      <w:r>
+        <w:rPr>
+          <w:b/>
+        </w:rPr>
+        <w:t>Statistical Significance of Generational Difference</w:t>
+      </w:r>
+    </w:p>
+    <w:p>
+      <w:r>
+        <w:t>The logistic regression interaction terms provide formal statistical evidence for whether delay's effect on loyalty is significantly different for Gen Z. A significant negative interaction coefficient means each additional minute of delay reduces Gen Z's loyalty probability more than it does for other generations.</w:t>
+      </w:r>
+    </w:p>
+    <w:p>
+      <w:r>
+        <w:rPr>
+          <w:b/>
+        </w:rPr>
+        <w:t>SHAP-Based Sensitivity Comparison</w:t>
+      </w:r>
+    </w:p>
+    <w:p>
+      <w:r>
+        <w:t>The per-generation SHAP comparison quantifies exactly how much more (or less) sensitive Gen Z is to delays compared to Millennials and Gen X. The side-by-side SHAP dependence plots reveal whether the relationship is linear (every minute hurts equally) or threshold-based (no effect until a certain point, then rapid deterioration).</w:t>
+      </w:r>
+    </w:p>
+    <w:p>
+      <w:r>
+        <w:rPr>
+          <w:b/>
+        </w:rPr>
+        <w:t>Actionable Recommendations for Problem 3</w:t>
+      </w:r>
+    </w:p>
+    <w:p>
+      <w:pPr>
+        <w:pStyle w:val="ListBullet"/>
+      </w:pPr>
+      <w:r>
+        <w:t>If Gen Z shows lower delay tolerance, prioritize on-time performance on routes with high Gen Z ridership</w:t>
+      </w:r>
+    </w:p>
+    <w:p>
+      <w:pPr>
+        <w:pStyle w:val="ListBullet"/>
+      </w:pPr>
+      <w:r>
+        <w:t>Consider proactive delay compensation (app notifications, vouchers) tailored to Gen Z preferences</w:t>
+      </w:r>
+    </w:p>
+    <w:p>
+      <w:pPr>
+        <w:pStyle w:val="ListBullet"/>
+      </w:pPr>
+      <w:r>
+        <w:t>Set delay-triggered retention actions at the identified Gen Z breaking point threshold</w:t>
+      </w:r>
+    </w:p>
+    <w:p>
+      <w:pPr>
+        <w:pStyle w:val="Heading2"/>
+      </w:pPr>
+      <w:r>
+        <w:t>9.4 Method Justification Summary</w:t>
       </w:r>
     </w:p>
     <w:tbl>
@@ -3688,6 +4044,129 @@
                 <w:sz w:val="20"/>
               </w:rPr>
               <w:t>Moves from "what matters" to "how much and in which direction for each individual" — enables actionable recommendations</w:t>
+            </w:r>
+          </w:p>
+        </w:tc>
+      </w:tr>
+      <w:tr>
+        <w:tc>
+          <w:tcPr>
+            <w:tcW w:type="dxa" w:w="2880"/>
+          </w:tcPr>
+          <w:p>
+            <w:r>
+              <w:rPr>
+                <w:sz w:val="20"/>
+              </w:rPr>
+              <w:t>Binned Delay Analysis</w:t>
+            </w:r>
+          </w:p>
+        </w:tc>
+        <w:tc>
+          <w:tcPr>
+            <w:tcW w:type="dxa" w:w="2880"/>
+          </w:tcPr>
+          <w:p>
+            <w:r>
+              <w:rPr>
+                <w:sz w:val="20"/>
+              </w:rPr>
+              <w:t>3</w:t>
+            </w:r>
+          </w:p>
+        </w:tc>
+        <w:tc>
+          <w:tcPr>
+            <w:tcW w:type="dxa" w:w="2880"/>
+          </w:tcPr>
+          <w:p>
+            <w:r>
+              <w:rPr>
+                <w:sz w:val="20"/>
+              </w:rPr>
+              <w:t>Reveals the practical delay threshold where Gen Z loyalty drops most steeply</w:t>
+            </w:r>
+          </w:p>
+        </w:tc>
+      </w:tr>
+      <w:tr>
+        <w:tc>
+          <w:tcPr>
+            <w:tcW w:type="dxa" w:w="2880"/>
+          </w:tcPr>
+          <w:p>
+            <w:r>
+              <w:rPr>
+                <w:sz w:val="20"/>
+              </w:rPr>
+              <w:t>Logistic Regression (Interaction)</w:t>
+            </w:r>
+          </w:p>
+        </w:tc>
+        <w:tc>
+          <w:tcPr>
+            <w:tcW w:type="dxa" w:w="2880"/>
+          </w:tcPr>
+          <w:p>
+            <w:r>
+              <w:rPr>
+                <w:sz w:val="20"/>
+              </w:rPr>
+              <w:t>3</w:t>
+            </w:r>
+          </w:p>
+        </w:tc>
+        <w:tc>
+          <w:tcPr>
+            <w:tcW w:type="dxa" w:w="2880"/>
+          </w:tcPr>
+          <w:p>
+            <w:r>
+              <w:rPr>
+                <w:sz w:val="20"/>
+              </w:rPr>
+              <w:t>Formal statistical test for whether delay affects Gen Z loyalty differently than other generations</w:t>
+            </w:r>
+          </w:p>
+        </w:tc>
+      </w:tr>
+      <w:tr>
+        <w:tc>
+          <w:tcPr>
+            <w:tcW w:type="dxa" w:w="2880"/>
+          </w:tcPr>
+          <w:p>
+            <w:r>
+              <w:rPr>
+                <w:sz w:val="20"/>
+              </w:rPr>
+              <w:t>Per-Generation SHAP</w:t>
+            </w:r>
+          </w:p>
+        </w:tc>
+        <w:tc>
+          <w:tcPr>
+            <w:tcW w:type="dxa" w:w="2880"/>
+          </w:tcPr>
+          <w:p>
+            <w:r>
+              <w:rPr>
+                <w:sz w:val="20"/>
+              </w:rPr>
+              <w:t>3</w:t>
+            </w:r>
+          </w:p>
+        </w:tc>
+        <w:tc>
+          <w:tcPr>
+            <w:tcW w:type="dxa" w:w="2880"/>
+          </w:tcPr>
+          <w:p>
+            <w:r>
+              <w:rPr>
+                <w:sz w:val="20"/>
+              </w:rPr>
+              <w:t>Captures non-linear delay effects and quantifies Gen Z sensitivity ratio vs older cohorts</w:t>
             </w:r>
           </w:p>
         </w:tc>

</xml_diff>